<commit_message>
update differential gene expression analysis
</commit_message>
<xml_diff>
--- a/_notes/to_do_RC.docx
+++ b/_notes/to_do_RC.docx
@@ -915,44 +915,150 @@
         </w:numPr>
       </w:pPr>
       <w:r>
-        <w:t xml:space="preserve">Try spearman </w:t>
+        <w:t>Try spearman corre</w:t>
+      </w:r>
+      <w:r>
+        <w:t>lati</w:t>
+      </w:r>
+      <w:r>
+        <w:t>on</w:t>
+      </w:r>
+    </w:p>
+    <w:p>
+      <w:pPr>
+        <w:pStyle w:val="ListParagraph"/>
+        <w:numPr>
+          <w:ilvl w:val="2"/>
+          <w:numId w:val="1"/>
+        </w:numPr>
+      </w:pPr>
+      <w:r>
+        <w:t xml:space="preserve">Try to remove those genes that have very low expression in scRNA-seq data. </w:t>
+      </w:r>
+    </w:p>
+    <w:p>
+      <w:pPr>
+        <w:pStyle w:val="ListParagraph"/>
+        <w:numPr>
+          <w:ilvl w:val="2"/>
+          <w:numId w:val="1"/>
+        </w:numPr>
+      </w:pPr>
+      <w:r>
+        <w:t xml:space="preserve">Summarize the correlation using </w:t>
       </w:r>
       <w:proofErr w:type="spellStart"/>
       <w:r>
-        <w:t>correatlion</w:t>
+        <w:t>ggcorrplot</w:t>
       </w:r>
       <w:proofErr w:type="spellEnd"/>
-    </w:p>
-    <w:p>
-      <w:pPr>
-        <w:pStyle w:val="ListParagraph"/>
-        <w:numPr>
-          <w:ilvl w:val="2"/>
-          <w:numId w:val="1"/>
-        </w:numPr>
-      </w:pPr>
-      <w:r>
-        <w:t xml:space="preserve">Try to remove those genes that have very low expression in scRNA-seq data. </w:t>
-      </w:r>
-    </w:p>
-    <w:p>
-      <w:pPr>
-        <w:pStyle w:val="ListParagraph"/>
-        <w:numPr>
-          <w:ilvl w:val="2"/>
-          <w:numId w:val="1"/>
-        </w:numPr>
-      </w:pPr>
-      <w:r>
-        <w:t xml:space="preserve">Summarize the correlation using </w:t>
+      <w:r>
+        <w:t>.</w:t>
+      </w:r>
+    </w:p>
+    <w:p>
+      <w:pPr>
+        <w:pStyle w:val="ListParagraph"/>
+        <w:ind w:left="1440"/>
+      </w:pPr>
+    </w:p>
+    <w:p>
+      <w:pPr>
+        <w:pStyle w:val="ListParagraph"/>
+        <w:numPr>
+          <w:ilvl w:val="0"/>
+          <w:numId w:val="1"/>
+        </w:numPr>
+      </w:pPr>
+      <w:r>
+        <w:t xml:space="preserve">Do differential expression analysis to identify genes that are differentially expressed in each cell type. </w:t>
+      </w:r>
+    </w:p>
+    <w:p>
+      <w:pPr>
+        <w:pStyle w:val="ListParagraph"/>
+        <w:numPr>
+          <w:ilvl w:val="1"/>
+          <w:numId w:val="1"/>
+        </w:numPr>
+      </w:pPr>
+      <w:r>
+        <w:t xml:space="preserve">For each of the </w:t>
+      </w:r>
+      <w:proofErr w:type="gramStart"/>
+      <w:r>
+        <w:t>9 cell</w:t>
+      </w:r>
+      <w:proofErr w:type="gramEnd"/>
+      <w:r>
+        <w:t xml:space="preserve"> type, compare the expression of the cells of this cell type versus all the other cell type using MAST. </w:t>
+      </w:r>
+      <w:r>
+        <w:t xml:space="preserve">Select those genes with small p-value and expression in this cell type than </w:t>
+      </w:r>
+      <w:proofErr w:type="gramStart"/>
+      <w:r>
+        <w:t>other</w:t>
+      </w:r>
+      <w:proofErr w:type="gramEnd"/>
+      <w:r>
+        <w:t xml:space="preserve"> cell type. Calculate a fold change. For example, for B cells, calculate the average expression B cells, denoted by </w:t>
       </w:r>
       <w:proofErr w:type="spellStart"/>
       <w:r>
-        <w:t>ggcorrplot</w:t>
+        <w:t>u_B</w:t>
       </w:r>
       <w:proofErr w:type="spellEnd"/>
       <w:r>
-        <w:t>.</w:t>
+        <w:t xml:space="preserve">, and the average expression in all other cells, denoted by </w:t>
+      </w:r>
+      <w:proofErr w:type="spellStart"/>
+      <w:r>
+        <w:t>u_O</w:t>
+      </w:r>
+      <w:proofErr w:type="spellEnd"/>
+      <w:r>
+        <w:t xml:space="preserve">, and select those genes with </w:t>
+      </w:r>
+      <w:proofErr w:type="spellStart"/>
+      <w:r>
+        <w:t>u_B</w:t>
+      </w:r>
+      <w:proofErr w:type="spellEnd"/>
+      <w:r>
+        <w:t xml:space="preserve"> &gt; </w:t>
+      </w:r>
+      <w:proofErr w:type="spellStart"/>
+      <w:r>
+        <w:t>u_O</w:t>
+      </w:r>
+      <w:proofErr w:type="spellEnd"/>
+      <w:r>
+        <w:t xml:space="preserve">. Select around 50-100 genes per cell type. Select those genes with p-value &lt; 0.05/# of test, among those, choose the top 50 with smallest fold change </w:t>
+      </w:r>
+      <w:proofErr w:type="spellStart"/>
+      <w:r>
+        <w:t>u_O</w:t>
+      </w:r>
+      <w:proofErr w:type="spellEnd"/>
+      <w:r>
+        <w:t>/</w:t>
+      </w:r>
+      <w:proofErr w:type="spellStart"/>
+      <w:r>
+        <w:t>u_B</w:t>
+      </w:r>
+      <w:proofErr w:type="spellEnd"/>
+      <w:r>
+        <w:t xml:space="preserve">, assuming </w:t>
+      </w:r>
+      <w:proofErr w:type="spellStart"/>
+      <w:r>
+        <w:t>u_B</w:t>
+      </w:r>
+      <w:proofErr w:type="spellEnd"/>
+      <w:r>
+        <w:t xml:space="preserve"> is larger than 0. </w:t>
       </w:r>
     </w:p>
     <w:p>
@@ -965,12 +1071,84 @@
       <w:pPr>
         <w:pStyle w:val="ListParagraph"/>
         <w:numPr>
+          <w:ilvl w:val="1"/>
+          <w:numId w:val="1"/>
+        </w:numPr>
+      </w:pPr>
+      <w:r>
+        <w:t>Just use around top 10,000 genes for testing by MAST</w:t>
+      </w:r>
+    </w:p>
+    <w:p>
+      <w:pPr>
+        <w:pStyle w:val="ListParagraph"/>
+      </w:pPr>
+    </w:p>
+    <w:p>
+      <w:pPr>
+        <w:pStyle w:val="ListParagraph"/>
+        <w:numPr>
+          <w:ilvl w:val="1"/>
+          <w:numId w:val="1"/>
+        </w:numPr>
+      </w:pPr>
+      <w:r>
+        <w:t xml:space="preserve">Draw histogram of p-values for each comparison. </w:t>
+      </w:r>
+    </w:p>
+    <w:p>
+      <w:pPr>
+        <w:pStyle w:val="ListParagraph"/>
+      </w:pPr>
+    </w:p>
+    <w:p>
+      <w:pPr>
+        <w:pStyle w:val="ListParagraph"/>
+        <w:numPr>
+          <w:ilvl w:val="1"/>
+          <w:numId w:val="1"/>
+        </w:numPr>
+      </w:pPr>
+      <w:r>
+        <w:t xml:space="preserve">Try to draw a volcano plot </w:t>
+      </w:r>
+      <w:r>
+        <w:t>for each comparison, which is a scatter plot with x-axis being log</w:t>
+      </w:r>
+      <w:proofErr w:type="gramStart"/>
+      <w:r>
+        <w:t>2( fold</w:t>
+      </w:r>
+      <w:proofErr w:type="gramEnd"/>
+      <w:r>
+        <w:t xml:space="preserve"> change) and y-axis is -log10(p-value). </w:t>
+      </w:r>
+    </w:p>
+    <w:p/>
+    <w:p>
+      <w:pPr>
+        <w:pStyle w:val="ListParagraph"/>
+        <w:ind w:left="1440"/>
+      </w:pPr>
+    </w:p>
+    <w:p>
+      <w:pPr>
+        <w:pStyle w:val="ListParagraph"/>
+        <w:numPr>
           <w:ilvl w:val="0"/>
           <w:numId w:val="1"/>
         </w:numPr>
       </w:pPr>
       <w:r>
-        <w:t xml:space="preserve">Do differential expression analysis to identify genes that are differentially expressed in each cell type. </w:t>
+        <w:t xml:space="preserve">Use the </w:t>
+      </w:r>
+      <w:proofErr w:type="spellStart"/>
+      <w:r>
+        <w:t>scRNAseq</w:t>
+      </w:r>
+      <w:proofErr w:type="spellEnd"/>
+      <w:r>
+        <w:t xml:space="preserve"> data to define cell types and estimate the proportion of those cell types in bulk tumor. </w:t>
       </w:r>
     </w:p>
     <w:p>
@@ -982,212 +1160,51 @@
         </w:numPr>
       </w:pPr>
       <w:r>
-        <w:t xml:space="preserve">For each of the </w:t>
+        <w:t>Read CIBERSORT/</w:t>
+      </w:r>
+      <w:proofErr w:type="spellStart"/>
+      <w:r>
+        <w:t>CIBERSORTx</w:t>
+      </w:r>
+      <w:proofErr w:type="spellEnd"/>
+      <w:r>
+        <w:t xml:space="preserve"> </w:t>
       </w:r>
       <w:proofErr w:type="gramStart"/>
       <w:r>
-        <w:t>9 cell</w:t>
+        <w:t>paper, and</w:t>
       </w:r>
       <w:proofErr w:type="gramEnd"/>
       <w:r>
-        <w:t xml:space="preserve"> type, compare the expression of the cells of this cell type versus all the other cell type using MAST. </w:t>
-      </w:r>
-      <w:r>
-        <w:t xml:space="preserve">Select those genes with small p-value and expression in this cell type than </w:t>
-      </w:r>
-      <w:proofErr w:type="gramStart"/>
-      <w:r>
-        <w:t>other</w:t>
-      </w:r>
-      <w:proofErr w:type="gramEnd"/>
-      <w:r>
-        <w:t xml:space="preserve"> cell type. Calculate a fold change. For example, for B cells, calculate the average expression B cells, denoted by </w:t>
+        <w:t xml:space="preserve"> </w:t>
       </w:r>
       <w:proofErr w:type="spellStart"/>
       <w:r>
-        <w:t>u_B</w:t>
+        <w:t>ICeD</w:t>
       </w:r>
       <w:proofErr w:type="spellEnd"/>
       <w:r>
-        <w:t xml:space="preserve">, and the average expression in all other cells, denoted by </w:t>
+        <w:t>-T paper.</w:t>
+      </w:r>
+    </w:p>
+    <w:p>
+      <w:pPr>
+        <w:pStyle w:val="ListParagraph"/>
+        <w:numPr>
+          <w:ilvl w:val="1"/>
+          <w:numId w:val="1"/>
+        </w:numPr>
+      </w:pPr>
+      <w:r>
+        <w:t xml:space="preserve">Apply </w:t>
       </w:r>
       <w:proofErr w:type="spellStart"/>
       <w:r>
-        <w:t>u_O</w:t>
+        <w:t>CIBERSORTx</w:t>
       </w:r>
       <w:proofErr w:type="spellEnd"/>
       <w:r>
-        <w:t xml:space="preserve">, and select those genes with </w:t>
-      </w:r>
-      <w:proofErr w:type="spellStart"/>
-      <w:r>
-        <w:t>u_B</w:t>
-      </w:r>
-      <w:proofErr w:type="spellEnd"/>
-      <w:r>
-        <w:t xml:space="preserve"> &gt; </w:t>
-      </w:r>
-      <w:proofErr w:type="spellStart"/>
-      <w:r>
-        <w:t>u_O</w:t>
-      </w:r>
-      <w:proofErr w:type="spellEnd"/>
-      <w:r>
-        <w:t xml:space="preserve">. Select around 50-100 genes per cell type. Select those genes with p-value &lt; 0.05/# of test, among those, choose the top 50 with smallest fold change </w:t>
-      </w:r>
-      <w:proofErr w:type="spellStart"/>
-      <w:r>
-        <w:t>u_O</w:t>
-      </w:r>
-      <w:proofErr w:type="spellEnd"/>
-      <w:r>
-        <w:t>/</w:t>
-      </w:r>
-      <w:proofErr w:type="spellStart"/>
-      <w:r>
-        <w:t>u_B</w:t>
-      </w:r>
-      <w:proofErr w:type="spellEnd"/>
-      <w:r>
-        <w:t xml:space="preserve">, assuming </w:t>
-      </w:r>
-      <w:proofErr w:type="spellStart"/>
-      <w:r>
-        <w:t>u_B</w:t>
-      </w:r>
-      <w:proofErr w:type="spellEnd"/>
-      <w:r>
-        <w:t xml:space="preserve"> is larger than 0. </w:t>
-      </w:r>
-    </w:p>
-    <w:p>
-      <w:pPr>
-        <w:pStyle w:val="ListParagraph"/>
-        <w:ind w:left="1440"/>
-      </w:pPr>
-    </w:p>
-    <w:p>
-      <w:pPr>
-        <w:pStyle w:val="ListParagraph"/>
-        <w:numPr>
-          <w:ilvl w:val="1"/>
-          <w:numId w:val="1"/>
-        </w:numPr>
-      </w:pPr>
-      <w:r>
-        <w:t>Just use around top 10,000 genes for testing by MAST</w:t>
-      </w:r>
-    </w:p>
-    <w:p>
-      <w:pPr>
-        <w:pStyle w:val="ListParagraph"/>
-      </w:pPr>
-    </w:p>
-    <w:p>
-      <w:pPr>
-        <w:pStyle w:val="ListParagraph"/>
-        <w:numPr>
-          <w:ilvl w:val="1"/>
-          <w:numId w:val="1"/>
-        </w:numPr>
-      </w:pPr>
-      <w:r>
-        <w:t xml:space="preserve">Draw histogram of p-values for each comparison. </w:t>
-      </w:r>
-    </w:p>
-    <w:p>
-      <w:pPr>
-        <w:pStyle w:val="ListParagraph"/>
-      </w:pPr>
-    </w:p>
-    <w:p>
-      <w:pPr>
-        <w:pStyle w:val="ListParagraph"/>
-        <w:numPr>
-          <w:ilvl w:val="1"/>
-          <w:numId w:val="1"/>
-        </w:numPr>
-      </w:pPr>
-      <w:r>
-        <w:t xml:space="preserve">Try to draw a volcano plot </w:t>
-      </w:r>
-      <w:r>
-        <w:t>for each comparison, which is a scatter plot with x-axis being log</w:t>
-      </w:r>
-      <w:proofErr w:type="gramStart"/>
-      <w:r>
-        <w:t>2( fold</w:t>
-      </w:r>
-      <w:proofErr w:type="gramEnd"/>
-      <w:r>
-        <w:t xml:space="preserve"> change) and y-axis is -log10(p-value). </w:t>
-      </w:r>
-    </w:p>
-    <w:p/>
-    <w:p>
-      <w:pPr>
-        <w:pStyle w:val="ListParagraph"/>
-        <w:ind w:left="1440"/>
-      </w:pPr>
-    </w:p>
-    <w:p>
-      <w:pPr>
-        <w:pStyle w:val="ListParagraph"/>
-        <w:numPr>
-          <w:ilvl w:val="0"/>
-          <w:numId w:val="1"/>
-        </w:numPr>
-      </w:pPr>
-      <w:r>
-        <w:t xml:space="preserve">Use the </w:t>
-      </w:r>
-      <w:proofErr w:type="spellStart"/>
-      <w:r>
-        <w:t>scRNAseq</w:t>
-      </w:r>
-      <w:proofErr w:type="spellEnd"/>
-      <w:r>
-        <w:t xml:space="preserve"> data to define cell types and estimate the proportion of those cell types in bulk tumor. </w:t>
-      </w:r>
-    </w:p>
-    <w:p>
-      <w:pPr>
-        <w:pStyle w:val="ListParagraph"/>
-        <w:numPr>
-          <w:ilvl w:val="1"/>
-          <w:numId w:val="1"/>
-        </w:numPr>
-      </w:pPr>
-      <w:r>
-        <w:t xml:space="preserve">Read CIBERSORT/CIBERSORTx </w:t>
-      </w:r>
-      <w:proofErr w:type="gramStart"/>
-      <w:r>
-        <w:t>paper, and</w:t>
-      </w:r>
-      <w:proofErr w:type="gramEnd"/>
-      <w:r>
-        <w:t xml:space="preserve"> </w:t>
-      </w:r>
-      <w:proofErr w:type="spellStart"/>
-      <w:r>
-        <w:t>ICeD</w:t>
-      </w:r>
-      <w:proofErr w:type="spellEnd"/>
-      <w:r>
-        <w:t>-T paper.</w:t>
-      </w:r>
-    </w:p>
-    <w:p>
-      <w:pPr>
-        <w:pStyle w:val="ListParagraph"/>
-        <w:numPr>
-          <w:ilvl w:val="1"/>
-          <w:numId w:val="1"/>
-        </w:numPr>
-      </w:pPr>
-      <w:r>
-        <w:t xml:space="preserve">Apply CIBERSORTx and </w:t>
+        <w:t xml:space="preserve"> and </w:t>
       </w:r>
       <w:proofErr w:type="spellStart"/>
       <w:r>

</xml_diff>

<commit_message>
update cell clustering result
</commit_message>
<xml_diff>
--- a/_notes/to_do_RC.docx
+++ b/_notes/to_do_RC.docx
@@ -550,6 +550,9 @@
       <w:r>
         <w:t>NK cells</w:t>
       </w:r>
+      <w:r>
+        <w:t>, (NK1, NK2, and NK3)</w:t>
+      </w:r>
     </w:p>
     <w:p>
       <w:pPr>
@@ -959,6 +962,38 @@
     <w:p>
       <w:pPr>
         <w:pStyle w:val="ListParagraph"/>
+        <w:numPr>
+          <w:ilvl w:val="1"/>
+          <w:numId w:val="1"/>
+        </w:numPr>
+      </w:pPr>
+      <w:r>
+        <w:t xml:space="preserve">Now we will have 11 clusters/cell types, try to compare the expression of LM22 vs. these 11 cell types, by a </w:t>
+      </w:r>
+      <w:proofErr w:type="spellStart"/>
+      <w:r>
+        <w:t>ggcorrplot</w:t>
+      </w:r>
+      <w:proofErr w:type="spellEnd"/>
+      <w:r>
+        <w:t xml:space="preserve">, using spearman correlation. </w:t>
+      </w:r>
+    </w:p>
+    <w:p>
+      <w:pPr>
+        <w:pStyle w:val="ListParagraph"/>
+        <w:numPr>
+          <w:ilvl w:val="1"/>
+          <w:numId w:val="1"/>
+        </w:numPr>
+      </w:pPr>
+      <w:r>
+        <w:t xml:space="preserve">Also check the correlation matrix of our 11 cell types. </w:t>
+      </w:r>
+    </w:p>
+    <w:p>
+      <w:pPr>
+        <w:pStyle w:val="ListParagraph"/>
         <w:ind w:left="1440"/>
       </w:pPr>
     </w:p>
@@ -1030,42 +1065,171 @@
       </w:r>
       <w:proofErr w:type="spellStart"/>
       <w:r>
-        <w:t>u_O</w:t>
+        <w:t>u_</w:t>
+      </w:r>
+      <w:proofErr w:type="gramStart"/>
+      <w:r>
+        <w:t>O</w:t>
       </w:r>
       <w:proofErr w:type="spellEnd"/>
       <w:r>
-        <w:t xml:space="preserve">. Select around 50-100 genes per cell type. Select those genes with p-value &lt; 0.05/# of test, among those, choose the top 50 with smallest fold change </w:t>
+        <w:t>..</w:t>
+      </w:r>
+      <w:proofErr w:type="gramEnd"/>
+      <w:r>
+        <w:t xml:space="preserve"> </w:t>
+      </w:r>
+    </w:p>
+    <w:p>
+      <w:pPr>
+        <w:pStyle w:val="ListParagraph"/>
+        <w:ind w:left="1440"/>
+      </w:pPr>
+    </w:p>
+    <w:p>
+      <w:pPr>
+        <w:pStyle w:val="ListParagraph"/>
+        <w:numPr>
+          <w:ilvl w:val="1"/>
+          <w:numId w:val="1"/>
+        </w:numPr>
+      </w:pPr>
+      <w:r>
+        <w:t>Just use around top 10,000 genes for testing by MAST</w:t>
+      </w:r>
+    </w:p>
+    <w:p>
+      <w:pPr>
+        <w:pStyle w:val="ListParagraph"/>
+      </w:pPr>
+    </w:p>
+    <w:p>
+      <w:pPr>
+        <w:pStyle w:val="ListParagraph"/>
+        <w:numPr>
+          <w:ilvl w:val="1"/>
+          <w:numId w:val="1"/>
+        </w:numPr>
+      </w:pPr>
+      <w:r>
+        <w:t xml:space="preserve">Draw histogram of p-values for each comparison. </w:t>
+      </w:r>
+    </w:p>
+    <w:p>
+      <w:pPr>
+        <w:pStyle w:val="ListParagraph"/>
+      </w:pPr>
+    </w:p>
+    <w:p>
+      <w:pPr>
+        <w:pStyle w:val="ListParagraph"/>
+        <w:numPr>
+          <w:ilvl w:val="1"/>
+          <w:numId w:val="1"/>
+        </w:numPr>
+      </w:pPr>
+      <w:r>
+        <w:t xml:space="preserve">Try to draw a volcano plot </w:t>
+      </w:r>
+      <w:r>
+        <w:t>for each comparison, which is a scatter plot with x-axis being log</w:t>
+      </w:r>
+      <w:proofErr w:type="gramStart"/>
+      <w:r>
+        <w:t>2( fold</w:t>
+      </w:r>
+      <w:proofErr w:type="gramEnd"/>
+      <w:r>
+        <w:t xml:space="preserve"> change) and y-axis is -log10(p-value). </w:t>
+      </w:r>
+    </w:p>
+    <w:p>
+      <w:pPr>
+        <w:pStyle w:val="ListParagraph"/>
+      </w:pPr>
+    </w:p>
+    <w:p>
+      <w:pPr>
+        <w:pStyle w:val="ListParagraph"/>
+        <w:numPr>
+          <w:ilvl w:val="1"/>
+          <w:numId w:val="1"/>
+        </w:numPr>
+      </w:pPr>
+      <w:r>
+        <w:t xml:space="preserve">Select </w:t>
+      </w:r>
+      <w:r>
+        <w:t>around 60</w:t>
+      </w:r>
+      <w:r>
+        <w:t xml:space="preserve"> genes per cell type. Select those genes </w:t>
+      </w:r>
+      <w:r>
+        <w:t>smallest p-value and fold change, by scanning a series of percentiles. For example, for 1 percentile, we select the intersection of the genes with p-value &lt; 1 percentile and fold change smaller than 1 percentile. Choose the percentile that gives use between 55 and 65 genes. Check how many genes are selected by more than one cell type</w:t>
+      </w:r>
+      <w:r>
+        <w:t>.</w:t>
+      </w:r>
+    </w:p>
+    <w:p>
+      <w:pPr>
+        <w:pStyle w:val="ListParagraph"/>
+      </w:pPr>
+    </w:p>
+    <w:p>
+      <w:pPr>
+        <w:pStyle w:val="ListParagraph"/>
+        <w:ind w:left="1440"/>
+      </w:pPr>
+    </w:p>
+    <w:p>
+      <w:pPr>
+        <w:pStyle w:val="ListParagraph"/>
+        <w:numPr>
+          <w:ilvl w:val="0"/>
+          <w:numId w:val="1"/>
+        </w:numPr>
+      </w:pPr>
+      <w:r>
+        <w:t xml:space="preserve">Use the </w:t>
       </w:r>
       <w:proofErr w:type="spellStart"/>
       <w:r>
-        <w:t>u_O</w:t>
+        <w:t>scRNAseq</w:t>
       </w:r>
       <w:proofErr w:type="spellEnd"/>
       <w:r>
-        <w:t>/</w:t>
+        <w:t xml:space="preserve"> data to define cell types and estimate the proportion of those cell types in bulk tumor. </w:t>
+      </w:r>
+    </w:p>
+    <w:p>
+      <w:pPr>
+        <w:pStyle w:val="ListParagraph"/>
+        <w:numPr>
+          <w:ilvl w:val="1"/>
+          <w:numId w:val="1"/>
+        </w:numPr>
+      </w:pPr>
+      <w:r>
+        <w:t xml:space="preserve">Read CIBERSORT/CIBERSORTx </w:t>
+      </w:r>
+      <w:proofErr w:type="gramStart"/>
+      <w:r>
+        <w:t>paper, and</w:t>
+      </w:r>
+      <w:proofErr w:type="gramEnd"/>
+      <w:r>
+        <w:t xml:space="preserve"> </w:t>
       </w:r>
       <w:proofErr w:type="spellStart"/>
       <w:r>
-        <w:t>u_B</w:t>
+        <w:t>ICeD</w:t>
       </w:r>
       <w:proofErr w:type="spellEnd"/>
       <w:r>
-        <w:t xml:space="preserve">, assuming </w:t>
-      </w:r>
-      <w:proofErr w:type="spellStart"/>
-      <w:r>
-        <w:t>u_B</w:t>
-      </w:r>
-      <w:proofErr w:type="spellEnd"/>
-      <w:r>
-        <w:t xml:space="preserve"> is larger than 0. </w:t>
-      </w:r>
-    </w:p>
-    <w:p>
-      <w:pPr>
-        <w:pStyle w:val="ListParagraph"/>
-        <w:ind w:left="1440"/>
-      </w:pPr>
+        <w:t>-T paper.</w:t>
+      </w:r>
     </w:p>
     <w:p>
       <w:pPr>
@@ -1076,135 +1240,7 @@
         </w:numPr>
       </w:pPr>
       <w:r>
-        <w:t>Just use around top 10,000 genes for testing by MAST</w:t>
-      </w:r>
-    </w:p>
-    <w:p>
-      <w:pPr>
-        <w:pStyle w:val="ListParagraph"/>
-      </w:pPr>
-    </w:p>
-    <w:p>
-      <w:pPr>
-        <w:pStyle w:val="ListParagraph"/>
-        <w:numPr>
-          <w:ilvl w:val="1"/>
-          <w:numId w:val="1"/>
-        </w:numPr>
-      </w:pPr>
-      <w:r>
-        <w:t xml:space="preserve">Draw histogram of p-values for each comparison. </w:t>
-      </w:r>
-    </w:p>
-    <w:p>
-      <w:pPr>
-        <w:pStyle w:val="ListParagraph"/>
-      </w:pPr>
-    </w:p>
-    <w:p>
-      <w:pPr>
-        <w:pStyle w:val="ListParagraph"/>
-        <w:numPr>
-          <w:ilvl w:val="1"/>
-          <w:numId w:val="1"/>
-        </w:numPr>
-      </w:pPr>
-      <w:r>
-        <w:t xml:space="preserve">Try to draw a volcano plot </w:t>
-      </w:r>
-      <w:r>
-        <w:t>for each comparison, which is a scatter plot with x-axis being log</w:t>
-      </w:r>
-      <w:proofErr w:type="gramStart"/>
-      <w:r>
-        <w:t>2( fold</w:t>
-      </w:r>
-      <w:proofErr w:type="gramEnd"/>
-      <w:r>
-        <w:t xml:space="preserve"> change) and y-axis is -log10(p-value). </w:t>
-      </w:r>
-    </w:p>
-    <w:p/>
-    <w:p>
-      <w:pPr>
-        <w:pStyle w:val="ListParagraph"/>
-        <w:ind w:left="1440"/>
-      </w:pPr>
-    </w:p>
-    <w:p>
-      <w:pPr>
-        <w:pStyle w:val="ListParagraph"/>
-        <w:numPr>
-          <w:ilvl w:val="0"/>
-          <w:numId w:val="1"/>
-        </w:numPr>
-      </w:pPr>
-      <w:r>
-        <w:t xml:space="preserve">Use the </w:t>
-      </w:r>
-      <w:proofErr w:type="spellStart"/>
-      <w:r>
-        <w:t>scRNAseq</w:t>
-      </w:r>
-      <w:proofErr w:type="spellEnd"/>
-      <w:r>
-        <w:t xml:space="preserve"> data to define cell types and estimate the proportion of those cell types in bulk tumor. </w:t>
-      </w:r>
-    </w:p>
-    <w:p>
-      <w:pPr>
-        <w:pStyle w:val="ListParagraph"/>
-        <w:numPr>
-          <w:ilvl w:val="1"/>
-          <w:numId w:val="1"/>
-        </w:numPr>
-      </w:pPr>
-      <w:r>
-        <w:t>Read CIBERSORT/</w:t>
-      </w:r>
-      <w:proofErr w:type="spellStart"/>
-      <w:r>
-        <w:t>CIBERSORTx</w:t>
-      </w:r>
-      <w:proofErr w:type="spellEnd"/>
-      <w:r>
-        <w:t xml:space="preserve"> </w:t>
-      </w:r>
-      <w:proofErr w:type="gramStart"/>
-      <w:r>
-        <w:t>paper, and</w:t>
-      </w:r>
-      <w:proofErr w:type="gramEnd"/>
-      <w:r>
-        <w:t xml:space="preserve"> </w:t>
-      </w:r>
-      <w:proofErr w:type="spellStart"/>
-      <w:r>
-        <w:t>ICeD</w:t>
-      </w:r>
-      <w:proofErr w:type="spellEnd"/>
-      <w:r>
-        <w:t>-T paper.</w:t>
-      </w:r>
-    </w:p>
-    <w:p>
-      <w:pPr>
-        <w:pStyle w:val="ListParagraph"/>
-        <w:numPr>
-          <w:ilvl w:val="1"/>
-          <w:numId w:val="1"/>
-        </w:numPr>
-      </w:pPr>
-      <w:r>
-        <w:t xml:space="preserve">Apply </w:t>
-      </w:r>
-      <w:proofErr w:type="spellStart"/>
-      <w:r>
-        <w:t>CIBERSORTx</w:t>
-      </w:r>
-      <w:proofErr w:type="spellEnd"/>
-      <w:r>
-        <w:t xml:space="preserve"> and </w:t>
+        <w:t xml:space="preserve">Apply CIBERSORTx and </w:t>
       </w:r>
       <w:proofErr w:type="spellStart"/>
       <w:r>

</xml_diff>